<commit_message>
web: hapus tombol APK, arahkan ke versi web; sesuaikan klaim offline/printer dan panduan Word
Co-Authored-By: Claude Sonnet 5.5 <noreply@anthropic.com>
</commit_message>
<xml_diff>
--- a/panduan/Panduan-Memulai-KASIRIN.docx
+++ b/panduan/Panduan-Memulai-KASIRIN.docx
@@ -95,7 +95,7 @@
                 <w:sz w:val="22"/>
                 <w:szCs w:val="22"/>
               </w:rPr>
-              <w:t xml:space="preserve">HP Android, sambungan internet untuk mengunduh aplikasi (setelahnya kasir tetap jalan tanpa internet), dan daftar produk beserta harganya.</w:t>
+              <w:t xml:space="preserve">HP (Android atau iPhone) dengan sambungan internet, dan daftar produk beserta harganya.</w:t>
             </w:r>
           </w:p>
         </w:tc>
@@ -118,7 +118,7 @@
           <w:sz w:val="30"/>
           <w:szCs w:val="30"/>
         </w:rPr>
-        <w:t xml:space="preserve">1. Pasang aplikasi</w:t>
+        <w:t xml:space="preserve">1. Buka KASIRIN</w:t>
       </w:r>
     </w:p>
     <w:p>
@@ -135,7 +135,7 @@
           <w:sz w:val="22"/>
           <w:szCs w:val="22"/>
         </w:rPr>
-        <w:t xml:space="preserve">Buka tautan unduhan di HP Android: </w:t>
+        <w:t xml:space="preserve">Buka tautan ini di browser HP (Chrome di Android, Safari di iPhone): </w:t>
       </w:r>
       <w:r>
         <w:rPr>
@@ -144,7 +144,7 @@
           <w:sz w:val="22"/>
           <w:szCs w:val="22"/>
         </w:rPr>
-        <w:t xml:space="preserve">anggiadip123-maker.github.io/kasirin-download</w:t>
+        <w:t xml:space="preserve">anggiadip123-maker.github.io/kasirin-download/app</w:t>
       </w:r>
     </w:p>
     <w:p>
@@ -161,7 +161,7 @@
           <w:sz w:val="22"/>
           <w:szCs w:val="22"/>
         </w:rPr>
-        <w:t xml:space="preserve">Tekan </w:t>
+        <w:t xml:space="preserve">Tekan menu browser, lalu pilih </w:t>
       </w:r>
       <w:r>
         <w:rPr>
@@ -170,14 +170,14 @@
           <w:sz w:val="22"/>
           <w:szCs w:val="22"/>
         </w:rPr>
-        <w:t xml:space="preserve">Download KASIRIN (Android)</w:t>
-      </w:r>
-      <w:r>
-        <w:rPr>
-          <w:sz w:val="22"/>
-          <w:szCs w:val="22"/>
-        </w:rPr>
-        <w:t xml:space="preserve">, lalu buka berkas yang terunduh.</w:t>
+        <w:t xml:space="preserve">Tambah ke Layar Utama</w:t>
+      </w:r>
+      <w:r>
+        <w:rPr>
+          <w:sz w:val="22"/>
+          <w:szCs w:val="22"/>
+        </w:rPr>
+        <w:t xml:space="preserve"> supaya KASIRIN punya ikon sendiri.</w:t>
       </w:r>
     </w:p>
     <w:p>
@@ -194,56 +194,7 @@
           <w:sz w:val="22"/>
           <w:szCs w:val="22"/>
         </w:rPr>
-        <w:t xml:space="preserve">Kalau Android menanyakan izin, pilih </w:t>
-      </w:r>
-      <w:r>
-        <w:rPr>
-          <w:b/>
-          <w:bCs/>
-          <w:sz w:val="22"/>
-          <w:szCs w:val="22"/>
-        </w:rPr>
-        <w:t xml:space="preserve">Izinkan dari sumber ini</w:t>
-      </w:r>
-      <w:r>
-        <w:rPr>
-          <w:sz w:val="22"/>
-          <w:szCs w:val="22"/>
-        </w:rPr>
-        <w:t xml:space="preserve">, lalu tekan </w:t>
-      </w:r>
-      <w:r>
-        <w:rPr>
-          <w:b/>
-          <w:bCs/>
-          <w:sz w:val="22"/>
-          <w:szCs w:val="22"/>
-        </w:rPr>
-        <w:t xml:space="preserve">Install</w:t>
-      </w:r>
-      <w:r>
-        <w:rPr>
-          <w:sz w:val="22"/>
-          <w:szCs w:val="22"/>
-        </w:rPr>
-        <w:t xml:space="preserve">.</w:t>
-      </w:r>
-    </w:p>
-    <w:p>
-      <w:pPr>
-        <w:pStyle w:val="ListParagraph"/>
-        <w:numPr>
-          <w:ilvl w:val="0"/>
-          <w:numId w:val="2"/>
-        </w:numPr>
-        <w:spacing w:after="70" w:line="290"/>
-      </w:pPr>
-      <w:r>
-        <w:rPr>
-          <w:sz w:val="22"/>
-          <w:szCs w:val="22"/>
-        </w:rPr>
-        <w:t xml:space="preserve">Buka KASIRIN dari ikon di layar utama.</w:t>
+        <w:t xml:space="preserve">Buka KASIRIN dari ikon di layar utama. Tidak perlu install dan tidak perlu akun.</w:t>
       </w:r>
     </w:p>
     <w:p>
@@ -255,39 +206,7 @@
           <w:sz w:val="22"/>
           <w:szCs w:val="22"/>
         </w:rPr>
-        <w:t xml:space="preserve">Pengguna iPhone: buka tautan yang sama di Safari, tekan </w:t>
-      </w:r>
-      <w:r>
-        <w:rPr>
-          <w:b/>
-          <w:bCs/>
-          <w:sz w:val="22"/>
-          <w:szCs w:val="22"/>
-        </w:rPr>
-        <w:t xml:space="preserve">Bagikan</w:t>
-      </w:r>
-      <w:r>
-        <w:rPr>
-          <w:sz w:val="22"/>
-          <w:szCs w:val="22"/>
-        </w:rPr>
-        <w:t xml:space="preserve"> lalu </w:t>
-      </w:r>
-      <w:r>
-        <w:rPr>
-          <w:b/>
-          <w:bCs/>
-          <w:sz w:val="22"/>
-          <w:szCs w:val="22"/>
-        </w:rPr>
-        <w:t xml:space="preserve">Tambah ke Layar Utama</w:t>
-      </w:r>
-      <w:r>
-        <w:rPr>
-          <w:sz w:val="22"/>
-          <w:szCs w:val="22"/>
-        </w:rPr>
-        <w:t xml:space="preserve">. Fitur printer Bluetooth tidak tersedia di iPhone.</w:t>
+        <w:t xml:space="preserve">Butuh sambungan internet untuk membuka aplikasinya. Data tokomu tersimpan di HP.</w:t>
       </w:r>
     </w:p>
     <w:p>
@@ -1253,7 +1172,7 @@
                 <w:sz w:val="22"/>
                 <w:szCs w:val="22"/>
               </w:rPr>
-              <w:t xml:space="preserve"> – tersimpan di Galeri, album KASIRIN.</w:t>
+              <w:t xml:space="preserve"> – struk diunduh sebagai gambar ke HP.</w:t>
             </w:r>
           </w:p>
           <w:p>
@@ -1279,7 +1198,7 @@
                 <w:sz w:val="22"/>
                 <w:szCs w:val="22"/>
               </w:rPr>
-              <w:t xml:space="preserve"> – langsung ke pelanggan.</w:t>
+              <w:t xml:space="preserve"> – simpan gambarnya, lalu kirim ke pelanggan lewat WhatsApp.</w:t>
             </w:r>
           </w:p>
           <w:p>
@@ -1305,7 +1224,7 @@
                 <w:sz w:val="22"/>
                 <w:szCs w:val="22"/>
               </w:rPr>
-              <w:t xml:space="preserve"> – lewat menu cetak Android.</w:t>
+              <w:t xml:space="preserve"> – lewat menu cetak browser ke printer yang tersambung.</w:t>
             </w:r>
           </w:p>
           <w:p>
@@ -1319,62 +1238,14 @@
                 <w:sz w:val="22"/>
                 <w:szCs w:val="22"/>
               </w:rPr>
-              <w:t xml:space="preserve">Printer thermal Bluetooth: </w:t>
-            </w:r>
-            <w:r>
-              <w:rPr>
-                <w:sz w:val="22"/>
-                <w:szCs w:val="22"/>
-              </w:rPr>
-              <w:t xml:space="preserve">pasangkan dulu printernya di Pengaturan Bluetooth HP. Lalu di KASIRIN buka </w:t>
-            </w:r>
-            <w:r>
-              <w:rPr>
-                <w:b/>
-                <w:bCs/>
-                <w:sz w:val="22"/>
-                <w:szCs w:val="22"/>
-              </w:rPr>
-              <w:t xml:space="preserve">Pengaturan → Printer Thermal Bluetooth → Pilih Printer</w:t>
-            </w:r>
-            <w:r>
-              <w:rPr>
-                <w:sz w:val="22"/>
-                <w:szCs w:val="22"/>
-              </w:rPr>
-              <w:t xml:space="preserve">, ketuk nama printer, tekan </w:t>
-            </w:r>
-            <w:r>
-              <w:rPr>
-                <w:b/>
-                <w:bCs/>
-                <w:sz w:val="22"/>
-                <w:szCs w:val="22"/>
-              </w:rPr>
-              <w:t xml:space="preserve">Test Print</w:t>
-            </w:r>
-            <w:r>
-              <w:rPr>
-                <w:sz w:val="22"/>
-                <w:szCs w:val="22"/>
-              </w:rPr>
-              <w:t xml:space="preserve">, dan nyalakan </w:t>
-            </w:r>
-            <w:r>
-              <w:rPr>
-                <w:b/>
-                <w:bCs/>
-                <w:sz w:val="22"/>
-                <w:szCs w:val="22"/>
-              </w:rPr>
-              <w:t xml:space="preserve">Gunakan Printer Bluetooth langsung</w:t>
-            </w:r>
-            <w:r>
-              <w:rPr>
-                <w:sz w:val="22"/>
-                <w:szCs w:val="22"/>
-              </w:rPr>
-              <w:t xml:space="preserve">.</w:t>
+              <w:t xml:space="preserve">Catatan: </w:t>
+            </w:r>
+            <w:r>
+              <w:rPr>
+                <w:sz w:val="22"/>
+                <w:szCs w:val="22"/>
+              </w:rPr>
+              <w:t xml:space="preserve">cetak langsung ke printer thermal Bluetooth hanya ada di versi aplikasi Android, yang masih dalam pengembangan.</w:t>
             </w:r>
           </w:p>
         </w:tc>
@@ -2189,14 +2060,14 @@
           <w:sz w:val="22"/>
           <w:szCs w:val="22"/>
         </w:rPr>
-        <w:t xml:space="preserve">Printer tidak muncul</w:t>
-      </w:r>
-      <w:r>
-        <w:rPr>
-          <w:sz w:val="22"/>
-          <w:szCs w:val="22"/>
-        </w:rPr>
-        <w:t xml:space="preserve"> – pastikan Bluetooth menyala, printer sudah dipasangkan di Pengaturan Bluetooth HP, dan izin "Perangkat di sekitar" diizinkan.</w:t>
+        <w:t xml:space="preserve">Data hilang setelah menghapus data browser</w:t>
+      </w:r>
+      <w:r>
+        <w:rPr>
+          <w:sz w:val="22"/>
+          <w:szCs w:val="22"/>
+        </w:rPr>
+        <w:t xml:space="preserve"> – data toko tersimpan di browser HP. Jangan hapus data situs untuk KASIRIN, dan rutin tekan Backup Data.</w:t>
       </w:r>
     </w:p>
     <w:p>

</xml_diff>